<commit_message>
Update Playbook with GEO Monitoring details and update docx
</commit_message>
<xml_diff>
--- a/AGENCY_PLAYBOOK.docx
+++ b/AGENCY_PLAYBOOK.docx
@@ -2,7 +2,7 @@
 <file path=word/document.xml><?xml version="1.0" encoding="utf-8"?>
 <w:document xmlns:w="http://schemas.openxmlformats.org/wordprocessingml/2006/main" xmlns:m="http://schemas.openxmlformats.org/officeDocument/2006/math" xmlns:r="http://schemas.openxmlformats.org/officeDocument/2006/relationships" xmlns:o="urn:schemas-microsoft-com:office:office" xmlns:v="urn:schemas-microsoft-com:vml" xmlns:w10="urn:schemas-microsoft-com:office:word" xmlns:a="http://schemas.openxmlformats.org/drawingml/2006/main" xmlns:pic="http://schemas.openxmlformats.org/drawingml/2006/picture" xmlns:wp="http://schemas.openxmlformats.org/drawingml/2006/wordprocessingDrawing">
   <w:body>
-    <w:bookmarkStart w:id="98" w:name="X23f7745dda461cceff0684112a17ba473942fb4"/>
+    <w:bookmarkStart w:id="102" w:name="X23f7745dda461cceff0684112a17ba473942fb4"/>
     <w:p>
       <w:pPr>
         <w:pStyle w:val="Heading1"/>
@@ -123,13 +123,13 @@
         <w:t xml:space="preserve">📦 Complete System Inventory (Everything This System Can Do)</w:t>
       </w:r>
     </w:p>
-    <w:bookmarkStart w:id="9" w:name="all-25-tools-python-scripts"/>
+    <w:bookmarkStart w:id="9" w:name="all-26-tools-python-js-scripts"/>
     <w:p>
       <w:pPr>
         <w:pStyle w:val="Heading3"/>
       </w:pPr>
       <w:r>
-        <w:t xml:space="preserve">🔧 All 25 Tools (Python Scripts)</w:t>
+        <w:t xml:space="preserve">🔧 All 26 Tools (Python &amp; JS Scripts)</w:t>
       </w:r>
     </w:p>
     <w:p>
@@ -776,6 +776,28 @@
       </w:r>
       <w:r>
         <w:t xml:space="preserve">- MCP server for integrations</w:t>
+      </w:r>
+      <w:r>
+        <w:t xml:space="preserve"> </w:t>
+      </w:r>
+      <w:r>
+        <w:t xml:space="preserve">26.</w:t>
+      </w:r>
+      <w:r>
+        <w:t xml:space="preserve"> </w:t>
+      </w:r>
+      <w:r>
+        <w:rPr>
+          <w:b/>
+          <w:bCs/>
+        </w:rPr>
+        <w:t xml:space="preserve">geo_monitor/</w:t>
+      </w:r>
+      <w:r>
+        <w:t xml:space="preserve"> </w:t>
+      </w:r>
+      <w:r>
+        <w:t xml:space="preserve">- Live AI query trackers (Perplexity, ChatGPT, Google AI) ⭐ NEW</w:t>
       </w:r>
     </w:p>
     <w:p>
@@ -786,13 +808,13 @@
       </w:r>
     </w:p>
     <w:bookmarkEnd w:id="9"/>
-    <w:bookmarkStart w:id="10" w:name="all-23-workflows-step-by-step-processes"/>
+    <w:bookmarkStart w:id="10" w:name="all-24-workflows-step-by-step-processes"/>
     <w:p>
       <w:pPr>
         <w:pStyle w:val="Heading3"/>
       </w:pPr>
       <w:r>
-        <w:t xml:space="preserve">📋 All 23 Workflows (Step-by-Step Processes)</w:t>
+        <w:t xml:space="preserve">📋 All 24 Workflows (Step-by-Step Processes)</w:t>
       </w:r>
     </w:p>
     <w:p>
@@ -1138,7 +1160,7 @@
         <w:t xml:space="preserve">content_draft.md</w:t>
       </w:r>
       <w:r>
-        <w:t xml:space="preserve">) - Write full articles (2,000+ words)</w:t>
+        <w:t xml:space="preserve">) - Write full articles (2,000+ words) ⭐ UPDATED 2026</w:t>
       </w:r>
       <w:r>
         <w:t xml:space="preserve"> </w:t>
@@ -1295,6 +1317,37 @@
       <w:r>
         <w:t xml:space="preserve">) - Design content hubs</w:t>
       </w:r>
+      <w:r>
+        <w:t xml:space="preserve"> </w:t>
+      </w:r>
+      <w:r>
+        <w:t xml:space="preserve">16.</w:t>
+      </w:r>
+      <w:r>
+        <w:t xml:space="preserve"> </w:t>
+      </w:r>
+      <w:r>
+        <w:rPr>
+          <w:b/>
+          <w:bCs/>
+        </w:rPr>
+        <w:t xml:space="preserve">/content_refresh</w:t>
+      </w:r>
+      <w:r>
+        <w:t xml:space="preserve"> </w:t>
+      </w:r>
+      <w:r>
+        <w:t xml:space="preserve">(</w:t>
+      </w:r>
+      <w:r>
+        <w:rPr>
+          <w:rStyle w:val="VerbatimChar"/>
+        </w:rPr>
+        <w:t xml:space="preserve">content_refresh.md</w:t>
+      </w:r>
+      <w:r>
+        <w:t xml:space="preserve">) - Track content age &amp; automate freshness updates ⭐ NEW 2026</w:t>
+      </w:r>
     </w:p>
     <w:p>
       <w:pPr>
@@ -1311,7 +1364,7 @@
         <w:t xml:space="preserve"> </w:t>
       </w:r>
       <w:r>
-        <w:t xml:space="preserve">16.</w:t>
+        <w:t xml:space="preserve">17.</w:t>
       </w:r>
       <w:r>
         <w:t xml:space="preserve"> </w:t>
@@ -1336,13 +1389,13 @@
         <w:t xml:space="preserve">audit.md</w:t>
       </w:r>
       <w:r>
-        <w:t xml:space="preserve">) - Full technical SEO audit (30-50 pages)</w:t>
-      </w:r>
-      <w:r>
-        <w:t xml:space="preserve"> </w:t>
-      </w:r>
-      <w:r>
-        <w:t xml:space="preserve">17.</w:t>
+        <w:t xml:space="preserve">) - Full technical SEO audit (30-50 pages) ⭐ UPDATED 2026</w:t>
+      </w:r>
+      <w:r>
+        <w:t xml:space="preserve"> </w:t>
+      </w:r>
+      <w:r>
+        <w:t xml:space="preserve">18.</w:t>
       </w:r>
       <w:r>
         <w:t xml:space="preserve"> </w:t>
@@ -1373,7 +1426,7 @@
         <w:t xml:space="preserve"> </w:t>
       </w:r>
       <w:r>
-        <w:t xml:space="preserve">18.</w:t>
+        <w:t xml:space="preserve">19.</w:t>
       </w:r>
       <w:r>
         <w:t xml:space="preserve"> </w:t>
@@ -1404,7 +1457,7 @@
         <w:t xml:space="preserve"> </w:t>
       </w:r>
       <w:r>
-        <w:t xml:space="preserve">19.</w:t>
+        <w:t xml:space="preserve">20.</w:t>
       </w:r>
       <w:r>
         <w:t xml:space="preserve"> </w:t>
@@ -1447,7 +1500,7 @@
         <w:t xml:space="preserve"> </w:t>
       </w:r>
       <w:r>
-        <w:t xml:space="preserve">20.</w:t>
+        <w:t xml:space="preserve">21.</w:t>
       </w:r>
       <w:r>
         <w:t xml:space="preserve"> </w:t>
@@ -1478,7 +1531,7 @@
         <w:t xml:space="preserve"> </w:t>
       </w:r>
       <w:r>
-        <w:t xml:space="preserve">21.</w:t>
+        <w:t xml:space="preserve">22.</w:t>
       </w:r>
       <w:r>
         <w:t xml:space="preserve"> </w:t>
@@ -1521,7 +1574,7 @@
         <w:t xml:space="preserve"> </w:t>
       </w:r>
       <w:r>
-        <w:t xml:space="preserve">22.</w:t>
+        <w:t xml:space="preserve">23.</w:t>
       </w:r>
       <w:r>
         <w:t xml:space="preserve"> </w:t>
@@ -1546,7 +1599,7 @@
         <w:t xml:space="preserve">link_building.md</w:t>
       </w:r>
       <w:r>
-        <w:t xml:space="preserve">) - Find links + draft outreach emails</w:t>
+        <w:t xml:space="preserve">) - Find links + draft outreach emails ⭐ UPDATED 2026</w:t>
       </w:r>
     </w:p>
     <w:p>
@@ -1564,7 +1617,7 @@
         <w:t xml:space="preserve"> </w:t>
       </w:r>
       <w:r>
-        <w:t xml:space="preserve">23.</w:t>
+        <w:t xml:space="preserve">24.</w:t>
       </w:r>
       <w:r>
         <w:t xml:space="preserve"> </w:t>
@@ -1589,7 +1642,7 @@
         <w:t xml:space="preserve">monthly_report.md</w:t>
       </w:r>
       <w:r>
-        <w:t xml:space="preserve">) - Auto-generate monthly reports</w:t>
+        <w:t xml:space="preserve">) - Auto-generate monthly reports ⭐ UPDATED 2026</w:t>
       </w:r>
     </w:p>
     <w:p>
@@ -1600,13 +1653,13 @@
       </w:r>
     </w:p>
     <w:bookmarkEnd w:id="10"/>
-    <w:bookmarkStart w:id="11" w:name="all-14-slash-commands-what-you-type"/>
+    <w:bookmarkStart w:id="11" w:name="all-15-slash-commands-what-you-type"/>
     <w:p>
       <w:pPr>
         <w:pStyle w:val="Heading3"/>
       </w:pPr>
       <w:r>
-        <w:t xml:space="preserve">🎛️ All 14 Slash Commands (What You Type)</w:t>
+        <w:t xml:space="preserve">🎛️ All 15 Slash Commands (What You Type)</w:t>
       </w:r>
     </w:p>
     <w:p>
@@ -1770,13 +1823,13 @@
         <w:rPr>
           <w:rStyle w:val="VerbatimChar"/>
         </w:rPr>
-        <w:t xml:space="preserve">/content_draft [client] --brief [file]</w:t>
-      </w:r>
-      <w:r>
-        <w:t xml:space="preserve"> </w:t>
-      </w:r>
-      <w:r>
-        <w:t xml:space="preserve">- Write full article</w:t>
+        <w:t xml:space="preserve">/content_draft [client] --brief [file] --aeo-mode chatgpt|perplexity|gemini</w:t>
+      </w:r>
+      <w:r>
+        <w:t xml:space="preserve"> </w:t>
+      </w:r>
+      <w:r>
+        <w:t xml:space="preserve">- Write full article ⭐ UPDATED</w:t>
       </w:r>
       <w:r>
         <w:t xml:space="preserve"> </w:t>
@@ -1791,6 +1844,27 @@
         <w:rPr>
           <w:rStyle w:val="VerbatimChar"/>
         </w:rPr>
+        <w:t xml:space="preserve">/content_refresh [client] --age-threshold 90</w:t>
+      </w:r>
+      <w:r>
+        <w:t xml:space="preserve"> </w:t>
+      </w:r>
+      <w:r>
+        <w:t xml:space="preserve">- Track &amp; update stale content ⭐ NEW</w:t>
+      </w:r>
+      <w:r>
+        <w:t xml:space="preserve"> </w:t>
+      </w:r>
+      <w:r>
+        <w:t xml:space="preserve">-</w:t>
+      </w:r>
+      <w:r>
+        <w:t xml:space="preserve"> </w:t>
+      </w:r>
+      <w:r>
+        <w:rPr>
+          <w:rStyle w:val="VerbatimChar"/>
+        </w:rPr>
         <w:t xml:space="preserve">/aeo_optimize</w:t>
       </w:r>
       <w:r>
@@ -1830,7 +1904,7 @@
         <w:t xml:space="preserve"> </w:t>
       </w:r>
       <w:r>
-        <w:t xml:space="preserve">- Full technical audit</w:t>
+        <w:t xml:space="preserve">- Full technical audit ⭐ UPDATED (MCP integrated)</w:t>
       </w:r>
       <w:r>
         <w:t xml:space="preserve"> </w:t>
@@ -1980,7 +2054,7 @@
         <w:t xml:space="preserve"> </w:t>
       </w:r>
       <w:r>
-        <w:t xml:space="preserve">- Find link opportunities</w:t>
+        <w:t xml:space="preserve">- Find link opportunities ⭐ UPDATED (2026 tactics)</w:t>
       </w:r>
       <w:r>
         <w:t xml:space="preserve"> </w:t>
@@ -2001,7 +2075,7 @@
         <w:t xml:space="preserve"> </w:t>
       </w:r>
       <w:r>
-        <w:t xml:space="preserve">- Generate monthly report</w:t>
+        <w:t xml:space="preserve">- Generate monthly report ⭐ UPDATED (MCP integrated)</w:t>
       </w:r>
     </w:p>
     <w:p>
@@ -2788,6 +2862,12 @@
         <w:t xml:space="preserve"> </w:t>
       </w:r>
       <w:r>
+        <w:t xml:space="preserve">⭐ UPDATED 2026</w:t>
+      </w:r>
+      <w:r>
+        <w:t xml:space="preserve"> </w:t>
+      </w:r>
+      <w:r>
         <w:t xml:space="preserve">-</w:t>
       </w:r>
       <w:r>
@@ -2804,7 +2884,7 @@
         <w:t xml:space="preserve"> </w:t>
       </w:r>
       <w:r>
-        <w:t xml:space="preserve">Scores content for AI search engine citability (0-100)</w:t>
+        <w:t xml:space="preserve">Scores content for AI search engine citability (0-100) with platform-specific scoring</w:t>
       </w:r>
       <w:r>
         <w:t xml:space="preserve"> </w:t>
@@ -2884,13 +2964,95 @@
           <w:b/>
           <w:bCs/>
         </w:rPr>
-        <w:t xml:space="preserve">Platform scores:</w:t>
-      </w:r>
-      <w:r>
-        <w:t xml:space="preserve"> </w:t>
-      </w:r>
-      <w:r>
-        <w:t xml:space="preserve">ChatGPT, Perplexity, Gemini (weighted differently)</w:t>
+        <w:t xml:space="preserve">Platform-specific scores (NEW):</w:t>
+      </w:r>
+      <w:r>
+        <w:t xml:space="preserve"> </w:t>
+      </w:r>
+      <w:r>
+        <w:t xml:space="preserve">-</w:t>
+      </w:r>
+      <w:r>
+        <w:t xml:space="preserve"> </w:t>
+      </w:r>
+      <w:r>
+        <w:rPr>
+          <w:b/>
+          <w:bCs/>
+        </w:rPr>
+        <w:t xml:space="preserve">ChatGPT (70% market):</w:t>
+      </w:r>
+      <w:r>
+        <w:t xml:space="preserve"> </w:t>
+      </w:r>
+      <w:r>
+        <w:t xml:space="preserve">Freshness +10, Citations +15, Answer blocks +10</w:t>
+      </w:r>
+      <w:r>
+        <w:t xml:space="preserve"> </w:t>
+      </w:r>
+      <w:r>
+        <w:t xml:space="preserve">-</w:t>
+      </w:r>
+      <w:r>
+        <w:t xml:space="preserve"> </w:t>
+      </w:r>
+      <w:r>
+        <w:rPr>
+          <w:b/>
+          <w:bCs/>
+        </w:rPr>
+        <w:t xml:space="preserve">Perplexity (citation-heavy):</w:t>
+      </w:r>
+      <w:r>
+        <w:t xml:space="preserve"> </w:t>
+      </w:r>
+      <w:r>
+        <w:t xml:space="preserve">Freshness +20 (CRITICAL), Citations +20, Numbered format +10</w:t>
+      </w:r>
+      <w:r>
+        <w:t xml:space="preserve"> </w:t>
+      </w:r>
+      <w:r>
+        <w:t xml:space="preserve">-</w:t>
+      </w:r>
+      <w:r>
+        <w:t xml:space="preserve"> </w:t>
+      </w:r>
+      <w:r>
+        <w:rPr>
+          <w:b/>
+          <w:bCs/>
+        </w:rPr>
+        <w:t xml:space="preserve">Gemini (Knowledge Graph):</w:t>
+      </w:r>
+      <w:r>
+        <w:t xml:space="preserve"> </w:t>
+      </w:r>
+      <w:r>
+        <w:t xml:space="preserve">Schema +20 (CRITICAL), Headings +10, Tables +10</w:t>
+      </w:r>
+      <w:r>
+        <w:t xml:space="preserve"> </w:t>
+      </w:r>
+      <w:r>
+        <w:t xml:space="preserve">-</w:t>
+      </w:r>
+      <w:r>
+        <w:t xml:space="preserve"> </w:t>
+      </w:r>
+      <w:r>
+        <w:rPr>
+          <w:b/>
+          <w:bCs/>
+        </w:rPr>
+        <w:t xml:space="preserve">Smart recommendations (NEW):</w:t>
+      </w:r>
+      <w:r>
+        <w:t xml:space="preserve"> </w:t>
+      </w:r>
+      <w:r>
+        <w:t xml:space="preserve">Identifies lowest-scoring platform as priority</w:t>
       </w:r>
       <w:r>
         <w:t xml:space="preserve"> </w:t>
@@ -2937,7 +3099,7 @@
         <w:t xml:space="preserve"> </w:t>
       </w:r>
       <w:r>
-        <w:t xml:space="preserve">Score + specific recommendations</w:t>
+        <w:t xml:space="preserve">Overall score + ChatGPT/Perplexity/Gemini scores + optimization priority recommendation</w:t>
       </w:r>
       <w:r>
         <w:t xml:space="preserve"> </w:t>
@@ -2959,7 +3121,7 @@
         <w:t xml:space="preserve"> </w:t>
       </w:r>
       <w:r>
-        <w:t xml:space="preserve">Content scoring 70+ gets cited 3x more often</w:t>
+        <w:t xml:space="preserve">Content scoring 70+ gets cited 3x more often. Perplexity cites &lt;90 day content 2.75x more (46.7% citation rate)</w:t>
       </w:r>
     </w:p>
     <w:p>
@@ -3907,6 +4069,12 @@
         <w:t xml:space="preserve"> </w:t>
       </w:r>
       <w:r>
+        <w:t xml:space="preserve">⭐ UPDATED 2026</w:t>
+      </w:r>
+      <w:r>
+        <w:t xml:space="preserve"> </w:t>
+      </w:r>
+      <w:r>
         <w:t xml:space="preserve">-</w:t>
       </w:r>
       <w:r>
@@ -3923,7 +4091,7 @@
         <w:t xml:space="preserve"> </w:t>
       </w:r>
       <w:r>
-        <w:t xml:space="preserve">Generates valid schema markup (JSON-LD)</w:t>
+        <w:t xml:space="preserve">Generates valid schema markup (JSON-LD) with triple stacking for Gemini optimization</w:t>
       </w:r>
       <w:r>
         <w:t xml:space="preserve"> </w:t>
@@ -3991,6 +4159,89 @@
           <w:b/>
           <w:bCs/>
         </w:rPr>
+        <w:t xml:space="preserve">TripleStack (NEW)</w:t>
+      </w:r>
+      <w:r>
+        <w:t xml:space="preserve"> </w:t>
+      </w:r>
+      <w:r>
+        <w:t xml:space="preserve">- Generates 3 schemas for maximum Gemini visibility</w:t>
+      </w:r>
+      <w:r>
+        <w:t xml:space="preserve"> </w:t>
+      </w:r>
+      <w:r>
+        <w:t xml:space="preserve">-</w:t>
+      </w:r>
+      <w:r>
+        <w:t xml:space="preserve"> </w:t>
+      </w:r>
+      <w:r>
+        <w:rPr>
+          <w:b/>
+          <w:bCs/>
+        </w:rPr>
+        <w:t xml:space="preserve">Triple Schema Stacking (NEW 2026):</w:t>
+      </w:r>
+      <w:r>
+        <w:t xml:space="preserve"> </w:t>
+      </w:r>
+      <w:r>
+        <w:t xml:space="preserve">- Generates Organization + Article + BreadcrumbList in one command</w:t>
+      </w:r>
+      <w:r>
+        <w:t xml:space="preserve"> </w:t>
+      </w:r>
+      <w:r>
+        <w:t xml:space="preserve">- Article publisher links to Organization via</w:t>
+      </w:r>
+      <w:r>
+        <w:t xml:space="preserve"> </w:t>
+      </w:r>
+      <w:r>
+        <w:t xml:space="preserve">@id</w:t>
+      </w:r>
+      <w:r>
+        <w:t xml:space="preserve"> </w:t>
+      </w:r>
+      <w:r>
+        <w:t xml:space="preserve">- Optimized for Google Knowledge Graph and Gemini AI</w:t>
+      </w:r>
+      <w:r>
+        <w:t xml:space="preserve"> </w:t>
+      </w:r>
+      <w:r>
+        <w:t xml:space="preserve">- Each schema in separate</w:t>
+      </w:r>
+      <w:r>
+        <w:t xml:space="preserve"> </w:t>
+      </w:r>
+      <w:r>
+        <w:rPr>
+          <w:rStyle w:val="VerbatimChar"/>
+        </w:rPr>
+        <w:t xml:space="preserve">&lt;script&gt;</w:t>
+      </w:r>
+      <w:r>
+        <w:t xml:space="preserve"> </w:t>
+      </w:r>
+      <w:r>
+        <w:t xml:space="preserve">tag</w:t>
+      </w:r>
+      <w:r>
+        <w:t xml:space="preserve"> </w:t>
+      </w:r>
+      <w:r>
+        <w:t xml:space="preserve">-</w:t>
+      </w:r>
+      <w:r>
+        <w:t xml:space="preserve"> </w:t>
+      </w:r>
+      <w:r>
+        <w:rPr>
+          <w:b/>
+          <w:bCs/>
+        </w:rPr>
         <w:t xml:space="preserve">Special features:</w:t>
       </w:r>
       <w:r>
@@ -4127,6 +4378,174 @@
           <w:rStyle w:val="NormalTok"/>
         </w:rPr>
         <w:t xml:space="preserve"> https://client.com</w:t>
+      </w:r>
+      <w:r>
+        <w:br/>
+      </w:r>
+      <w:r>
+        <w:br/>
+      </w:r>
+      <w:r>
+        <w:rPr>
+          <w:rStyle w:val="CommentTok"/>
+        </w:rPr>
+        <w:t xml:space="preserve"># Triple stack (Gemini optimization) - NEW</w:t>
+      </w:r>
+      <w:r>
+        <w:br/>
+      </w:r>
+      <w:r>
+        <w:rPr>
+          <w:rStyle w:val="ExtensionTok"/>
+        </w:rPr>
+        <w:t xml:space="preserve">python</w:t>
+      </w:r>
+      <w:r>
+        <w:rPr>
+          <w:rStyle w:val="NormalTok"/>
+        </w:rPr>
+        <w:t xml:space="preserve"> tools/schema_gen.py </w:t>
+      </w:r>
+      <w:r>
+        <w:rPr>
+          <w:rStyle w:val="AttributeTok"/>
+        </w:rPr>
+        <w:t xml:space="preserve">--type</w:t>
+      </w:r>
+      <w:r>
+        <w:rPr>
+          <w:rStyle w:val="NormalTok"/>
+        </w:rPr>
+        <w:t xml:space="preserve"> TripleStack </w:t>
+      </w:r>
+      <w:r>
+        <w:rPr>
+          <w:rStyle w:val="AttributeTok"/>
+        </w:rPr>
+        <w:t xml:space="preserve">--org-name</w:t>
+      </w:r>
+      <w:r>
+        <w:rPr>
+          <w:rStyle w:val="NormalTok"/>
+        </w:rPr>
+        <w:t xml:space="preserve"> </w:t>
+      </w:r>
+      <w:r>
+        <w:rPr>
+          <w:rStyle w:val="StringTok"/>
+        </w:rPr>
+        <w:t xml:space="preserve">"Acme"</w:t>
+      </w:r>
+      <w:r>
+        <w:rPr>
+          <w:rStyle w:val="NormalTok"/>
+        </w:rPr>
+        <w:t xml:space="preserve"> </w:t>
+      </w:r>
+      <w:r>
+        <w:rPr>
+          <w:rStyle w:val="AttributeTok"/>
+        </w:rPr>
+        <w:t xml:space="preserve">--url</w:t>
+      </w:r>
+      <w:r>
+        <w:rPr>
+          <w:rStyle w:val="NormalTok"/>
+        </w:rPr>
+        <w:t xml:space="preserve"> https://acme.com </w:t>
+      </w:r>
+      <w:r>
+        <w:rPr>
+          <w:rStyle w:val="DataTypeTok"/>
+        </w:rPr>
+        <w:t xml:space="preserve">\</w:t>
+      </w:r>
+      <w:r>
+        <w:br/>
+      </w:r>
+      <w:r>
+        <w:rPr>
+          <w:rStyle w:val="NormalTok"/>
+        </w:rPr>
+        <w:t xml:space="preserve">  </w:t>
+      </w:r>
+      <w:r>
+        <w:rPr>
+          <w:rStyle w:val="AttributeTok"/>
+        </w:rPr>
+        <w:t xml:space="preserve">--title</w:t>
+      </w:r>
+      <w:r>
+        <w:rPr>
+          <w:rStyle w:val="NormalTok"/>
+        </w:rPr>
+        <w:t xml:space="preserve"> </w:t>
+      </w:r>
+      <w:r>
+        <w:rPr>
+          <w:rStyle w:val="StringTok"/>
+        </w:rPr>
+        <w:t xml:space="preserve">"Article Title"</w:t>
+      </w:r>
+      <w:r>
+        <w:rPr>
+          <w:rStyle w:val="NormalTok"/>
+        </w:rPr>
+        <w:t xml:space="preserve"> </w:t>
+      </w:r>
+      <w:r>
+        <w:rPr>
+          <w:rStyle w:val="AttributeTok"/>
+        </w:rPr>
+        <w:t xml:space="preserve">--wikidata-id</w:t>
+      </w:r>
+      <w:r>
+        <w:rPr>
+          <w:rStyle w:val="NormalTok"/>
+        </w:rPr>
+        <w:t xml:space="preserve"> </w:t>
+      </w:r>
+      <w:r>
+        <w:rPr>
+          <w:rStyle w:val="StringTok"/>
+        </w:rPr>
+        <w:t xml:space="preserve">"Q12345"</w:t>
+      </w:r>
+      <w:r>
+        <w:rPr>
+          <w:rStyle w:val="NormalTok"/>
+        </w:rPr>
+        <w:t xml:space="preserve"> </w:t>
+      </w:r>
+      <w:r>
+        <w:rPr>
+          <w:rStyle w:val="AttributeTok"/>
+        </w:rPr>
+        <w:t xml:space="preserve">--breadcrumbs-json</w:t>
+      </w:r>
+      <w:r>
+        <w:rPr>
+          <w:rStyle w:val="NormalTok"/>
+        </w:rPr>
+        <w:t xml:space="preserve"> </w:t>
+      </w:r>
+      <w:r>
+        <w:rPr>
+          <w:rStyle w:val="StringTok"/>
+        </w:rPr>
+        <w:t xml:space="preserve">'[...]'</w:t>
+      </w:r>
+      <w:r>
+        <w:rPr>
+          <w:rStyle w:val="NormalTok"/>
+        </w:rPr>
+        <w:t xml:space="preserve"> </w:t>
+      </w:r>
+      <w:r>
+        <w:rPr>
+          <w:rStyle w:val="AttributeTok"/>
+        </w:rPr>
+        <w:t xml:space="preserve">--wrap-html</w:t>
       </w:r>
       <w:r>
         <w:br/>
@@ -6406,6 +6825,241 @@
       </w:r>
       <w:r>
         <w:t xml:space="preserve">Custom integrations</w:t>
+      </w:r>
+    </w:p>
+    <w:p>
+      <w:pPr>
+        <w:pStyle w:val="BodyText"/>
+      </w:pPr>
+      <w:r>
+        <w:rPr>
+          <w:b/>
+          <w:bCs/>
+        </w:rPr>
+        <w:t xml:space="preserve">26. geo_monitor/ (AI Citation Accuracy Trackers)</w:t>
+      </w:r>
+      <w:r>
+        <w:t xml:space="preserve"> </w:t>
+      </w:r>
+      <w:r>
+        <w:t xml:space="preserve">⭐ NEW 2026</w:t>
+      </w:r>
+      <w:r>
+        <w:t xml:space="preserve"> </w:t>
+      </w:r>
+      <w:r>
+        <w:t xml:space="preserve">-</w:t>
+      </w:r>
+      <w:r>
+        <w:t xml:space="preserve"> </w:t>
+      </w:r>
+      <w:r>
+        <w:rPr>
+          <w:b/>
+          <w:bCs/>
+        </w:rPr>
+        <w:t xml:space="preserve">What it does:</w:t>
+      </w:r>
+      <w:r>
+        <w:t xml:space="preserve"> </w:t>
+      </w:r>
+      <w:r>
+        <w:t xml:space="preserve">Real-time API monitoring scripts that simulate user queries against ChatGPT, Perplexity, and Google AI Overviews to check if your content is actually being cited.</w:t>
+      </w:r>
+      <w:r>
+        <w:t xml:space="preserve"> </w:t>
+      </w:r>
+      <w:r>
+        <w:t xml:space="preserve">-</w:t>
+      </w:r>
+      <w:r>
+        <w:t xml:space="preserve"> </w:t>
+      </w:r>
+      <w:r>
+        <w:rPr>
+          <w:b/>
+          <w:bCs/>
+        </w:rPr>
+        <w:t xml:space="preserve">Includes:</w:t>
+      </w:r>
+      <w:r>
+        <w:t xml:space="preserve"> </w:t>
+      </w:r>
+      <w:r>
+        <w:t xml:space="preserve">-</w:t>
+      </w:r>
+      <w:r>
+        <w:t xml:space="preserve"> </w:t>
+      </w:r>
+      <w:r>
+        <w:rPr>
+          <w:rStyle w:val="VerbatimChar"/>
+        </w:rPr>
+        <w:t xml:space="preserve">perplexity.js</w:t>
+      </w:r>
+      <w:r>
+        <w:t xml:space="preserve"> </w:t>
+      </w:r>
+      <w:r>
+        <w:t xml:space="preserve">(queries the sonar model and counts exact citations)</w:t>
+      </w:r>
+      <w:r>
+        <w:t xml:space="preserve"> </w:t>
+      </w:r>
+      <w:r>
+        <w:t xml:space="preserve">-</w:t>
+      </w:r>
+      <w:r>
+        <w:t xml:space="preserve"> </w:t>
+      </w:r>
+      <w:r>
+        <w:rPr>
+          <w:rStyle w:val="VerbatimChar"/>
+        </w:rPr>
+        <w:t xml:space="preserve">chatgpt_search.js</w:t>
+      </w:r>
+      <w:r>
+        <w:t xml:space="preserve"> </w:t>
+      </w:r>
+      <w:r>
+        <w:t xml:space="preserve">(tests ChatGPT’s web search capabilities)</w:t>
+      </w:r>
+      <w:r>
+        <w:t xml:space="preserve"> </w:t>
+      </w:r>
+      <w:r>
+        <w:t xml:space="preserve">-</w:t>
+      </w:r>
+      <w:r>
+        <w:t xml:space="preserve"> </w:t>
+      </w:r>
+      <w:r>
+        <w:rPr>
+          <w:rStyle w:val="VerbatimChar"/>
+        </w:rPr>
+        <w:t xml:space="preserve">google_ai_overview.js</w:t>
+      </w:r>
+      <w:r>
+        <w:t xml:space="preserve"> </w:t>
+      </w:r>
+      <w:r>
+        <w:t xml:space="preserve">(checks SERPs for People Also Ask and AI overviews)</w:t>
+      </w:r>
+      <w:r>
+        <w:t xml:space="preserve"> </w:t>
+      </w:r>
+      <w:r>
+        <w:t xml:space="preserve">-</w:t>
+      </w:r>
+      <w:r>
+        <w:t xml:space="preserve"> </w:t>
+      </w:r>
+      <w:r>
+        <w:rPr>
+          <w:b/>
+          <w:bCs/>
+        </w:rPr>
+        <w:t xml:space="preserve">How to use:</w:t>
+      </w:r>
+      <w:r>
+        <w:t xml:space="preserve"> </w:t>
+      </w:r>
+      <w:r>
+        <w:rPr>
+          <w:rStyle w:val="VerbatimChar"/>
+        </w:rPr>
+        <w:t xml:space="preserve">node tools/geo_monitor/perplexity.js</w:t>
+      </w:r>
+      <w:r>
+        <w:t xml:space="preserve"> </w:t>
+      </w:r>
+      <w:r>
+        <w:t xml:space="preserve">-</w:t>
+      </w:r>
+      <w:r>
+        <w:t xml:space="preserve"> </w:t>
+      </w:r>
+      <w:r>
+        <w:rPr>
+          <w:b/>
+          <w:bCs/>
+        </w:rPr>
+        <w:t xml:space="preserve">Output:</w:t>
+      </w:r>
+      <w:r>
+        <w:t xml:space="preserve"> </w:t>
+      </w:r>
+      <w:r>
+        <w:t xml:space="preserve">Live metrics including response time, cost, and explicit citations found.</w:t>
+      </w:r>
+      <w:r>
+        <w:t xml:space="preserve"> </w:t>
+      </w:r>
+      <w:r>
+        <w:t xml:space="preserve">-</w:t>
+      </w:r>
+      <w:r>
+        <w:t xml:space="preserve"> </w:t>
+      </w:r>
+      <w:r>
+        <w:rPr>
+          <w:b/>
+          <w:bCs/>
+        </w:rPr>
+        <w:t xml:space="preserve">Use case:</w:t>
+      </w:r>
+      <w:r>
+        <w:t xml:space="preserve"> </w:t>
+      </w:r>
+      <w:r>
+        <w:t xml:space="preserve">Unlike</w:t>
+      </w:r>
+      <w:r>
+        <w:t xml:space="preserve"> </w:t>
+      </w:r>
+      <w:r>
+        <w:rPr>
+          <w:rStyle w:val="VerbatimChar"/>
+        </w:rPr>
+        <w:t xml:space="preserve">aeo_grader.py</w:t>
+      </w:r>
+      <w:r>
+        <w:t xml:space="preserve"> </w:t>
+      </w:r>
+      <w:r>
+        <w:t xml:space="preserve">which</w:t>
+      </w:r>
+      <w:r>
+        <w:t xml:space="preserve"> </w:t>
+      </w:r>
+      <w:r>
+        <w:rPr>
+          <w:i/>
+          <w:iCs/>
+        </w:rPr>
+        <w:t xml:space="preserve">predicts</w:t>
+      </w:r>
+      <w:r>
+        <w:t xml:space="preserve"> </w:t>
+      </w:r>
+      <w:r>
+        <w:t xml:space="preserve">performance before publishing, these scripts provide</w:t>
+      </w:r>
+      <w:r>
+        <w:t xml:space="preserve"> </w:t>
+      </w:r>
+      <w:r>
+        <w:rPr>
+          <w:i/>
+          <w:iCs/>
+        </w:rPr>
+        <w:t xml:space="preserve">very accurate, real data</w:t>
+      </w:r>
+      <w:r>
+        <w:t xml:space="preserve"> </w:t>
+      </w:r>
+      <w:r>
+        <w:t xml:space="preserve">after publishing to prove AEO/GEO ROI to clients.</w:t>
       </w:r>
     </w:p>
     <w:p>
@@ -17339,7 +17993,721 @@
     </w:p>
     <w:bookmarkEnd w:id="95"/>
     <w:bookmarkEnd w:id="96"/>
-    <w:bookmarkStart w:id="97" w:name="why-trust-this-system-the-80-rule"/>
+    <w:bookmarkStart w:id="100" w:name="system-updates-march-2026"/>
+    <w:p>
+      <w:pPr>
+        <w:pStyle w:val="Heading2"/>
+      </w:pPr>
+      <w:r>
+        <w:t xml:space="preserve">🆕 2026 System Updates (March 2026)</w:t>
+      </w:r>
+    </w:p>
+    <w:p>
+      <w:pPr>
+        <w:pStyle w:val="FirstParagraph"/>
+      </w:pPr>
+      <w:r>
+        <w:rPr>
+          <w:b/>
+          <w:bCs/>
+        </w:rPr>
+        <w:t xml:space="preserve">Major upgrades deployed to optimize for AI Search, Content Freshness, and MCP performance:</w:t>
+      </w:r>
+    </w:p>
+    <w:bookmarkStart w:id="97" w:name="X86f87850c0d7a5d390de11ac9f2c255c8f2dd37"/>
+    <w:p>
+      <w:pPr>
+        <w:pStyle w:val="Heading3"/>
+      </w:pPr>
+      <w:r>
+        <w:t xml:space="preserve">Priority 1: AI Search &amp; MCP Integration (Deployed)</w:t>
+      </w:r>
+    </w:p>
+    <w:p>
+      <w:pPr>
+        <w:pStyle w:val="FirstParagraph"/>
+      </w:pPr>
+      <w:r>
+        <w:rPr>
+          <w:b/>
+          <w:bCs/>
+        </w:rPr>
+        <w:t xml:space="preserve">1. Platform-Specific Content Optimization</w:t>
+      </w:r>
+      <w:r>
+        <w:t xml:space="preserve"> </w:t>
+      </w:r>
+      <w:r>
+        <w:t xml:space="preserve">-</w:t>
+      </w:r>
+      <w:r>
+        <w:t xml:space="preserve"> </w:t>
+      </w:r>
+      <w:r>
+        <w:rPr>
+          <w:rStyle w:val="VerbatimChar"/>
+        </w:rPr>
+        <w:t xml:space="preserve">/content_draft</w:t>
+      </w:r>
+      <w:r>
+        <w:t xml:space="preserve"> </w:t>
+      </w:r>
+      <w:r>
+        <w:t xml:space="preserve">now supports</w:t>
+      </w:r>
+      <w:r>
+        <w:t xml:space="preserve"> </w:t>
+      </w:r>
+      <w:r>
+        <w:rPr>
+          <w:rStyle w:val="VerbatimChar"/>
+        </w:rPr>
+        <w:t xml:space="preserve">--aeo-mode chatgpt|perplexity|gemini</w:t>
+      </w:r>
+      <w:r>
+        <w:t xml:space="preserve"> </w:t>
+      </w:r>
+      <w:r>
+        <w:t xml:space="preserve">- ChatGPT mode: 2000+ words, 5+ citations, deep H2→H3→H4 structure</w:t>
+      </w:r>
+      <w:r>
+        <w:t xml:space="preserve"> </w:t>
+      </w:r>
+      <w:r>
+        <w:t xml:space="preserve">- Perplexity mode: Freshness dates, &lt;90 day content (46.7% citation rate), #1/#2/#3 numbered format</w:t>
+      </w:r>
+      <w:r>
+        <w:t xml:space="preserve"> </w:t>
+      </w:r>
+      <w:r>
+        <w:t xml:space="preserve">- Gemini mode: Triple schema stacking, entity linking, Knowledge Graph optimization</w:t>
+      </w:r>
+    </w:p>
+    <w:p>
+      <w:pPr>
+        <w:pStyle w:val="BodyText"/>
+      </w:pPr>
+      <w:r>
+        <w:rPr>
+          <w:b/>
+          <w:bCs/>
+        </w:rPr>
+        <w:t xml:space="preserve">2. E-E-A-T Visual Proof Requirements</w:t>
+      </w:r>
+      <w:r>
+        <w:t xml:space="preserve"> </w:t>
+      </w:r>
+      <w:r>
+        <w:t xml:space="preserve">- Mandatory minimum 2 visual elements per article (screenshots, data tables, process images)</w:t>
+      </w:r>
+      <w:r>
+        <w:t xml:space="preserve"> </w:t>
+      </w:r>
+      <w:r>
+        <w:t xml:space="preserve">- Descriptive image filenames (not image001.png)</w:t>
+      </w:r>
+      <w:r>
+        <w:t xml:space="preserve"> </w:t>
+      </w:r>
+      <w:r>
+        <w:t xml:space="preserve">- Alt text: 50-125 chars with primary keyword</w:t>
+      </w:r>
+      <w:r>
+        <w:t xml:space="preserve"> </w:t>
+      </w:r>
+      <w:r>
+        <w:t xml:space="preserve">- Frequency: 1 image per 300 words minimum</w:t>
+      </w:r>
+    </w:p>
+    <w:p>
+      <w:pPr>
+        <w:pStyle w:val="BodyText"/>
+      </w:pPr>
+      <w:r>
+        <w:rPr>
+          <w:b/>
+          <w:bCs/>
+        </w:rPr>
+        <w:t xml:space="preserve">3. Numbered Ranking Template</w:t>
+      </w:r>
+      <w:r>
+        <w:t xml:space="preserve"> </w:t>
+      </w:r>
+      <w:r>
+        <w:t xml:space="preserve">-</w:t>
+      </w:r>
+      <w:r>
+        <w:t xml:space="preserve"> </w:t>
+      </w:r>
+      <w:r>
+        <w:t xml:space="preserve">“Best X”</w:t>
+      </w:r>
+      <w:r>
+        <w:t xml:space="preserve"> </w:t>
+      </w:r>
+      <w:r>
+        <w:t xml:space="preserve">article structure (AI engines cite 3.2x more than unstructured lists)</w:t>
+      </w:r>
+      <w:r>
+        <w:t xml:space="preserve"> </w:t>
+      </w:r>
+      <w:r>
+        <w:t xml:space="preserve">- Mandatory #1, #2, #3 format (not</w:t>
+      </w:r>
+      <w:r>
+        <w:t xml:space="preserve"> </w:t>
+      </w:r>
+      <w:r>
+        <w:t xml:space="preserve">“First”</w:t>
+      </w:r>
+      <w:r>
+        <w:t xml:space="preserve">,</w:t>
+      </w:r>
+      <w:r>
+        <w:t xml:space="preserve"> </w:t>
+      </w:r>
+      <w:r>
+        <w:t xml:space="preserve">“Second”</w:t>
+      </w:r>
+      <w:r>
+        <w:t xml:space="preserve">,</w:t>
+      </w:r>
+      <w:r>
+        <w:t xml:space="preserve"> </w:t>
+      </w:r>
+      <w:r>
+        <w:t xml:space="preserve">“Third”</w:t>
+      </w:r>
+      <w:r>
+        <w:t xml:space="preserve">)</w:t>
+      </w:r>
+      <w:r>
+        <w:t xml:space="preserve"> </w:t>
+      </w:r>
+      <w:r>
+        <w:t xml:space="preserve">- Includes</w:t>
+      </w:r>
+      <w:r>
+        <w:t xml:space="preserve"> </w:t>
+      </w:r>
+      <w:r>
+        <w:t xml:space="preserve">“X vs Y”</w:t>
+      </w:r>
+      <w:r>
+        <w:t xml:space="preserve"> </w:t>
+      </w:r>
+      <w:r>
+        <w:t xml:space="preserve">comparison template with Winner column</w:t>
+      </w:r>
+    </w:p>
+    <w:p>
+      <w:pPr>
+        <w:pStyle w:val="BodyText"/>
+      </w:pPr>
+      <w:r>
+        <w:rPr>
+          <w:b/>
+          <w:bCs/>
+        </w:rPr>
+        <w:t xml:space="preserve">4. Triple Schema Stacking</w:t>
+      </w:r>
+      <w:r>
+        <w:t xml:space="preserve"> </w:t>
+      </w:r>
+      <w:r>
+        <w:t xml:space="preserve">-</w:t>
+      </w:r>
+      <w:r>
+        <w:t xml:space="preserve"> </w:t>
+      </w:r>
+      <w:r>
+        <w:rPr>
+          <w:rStyle w:val="VerbatimChar"/>
+        </w:rPr>
+        <w:t xml:space="preserve">schema_gen.py --type TripleStack</w:t>
+      </w:r>
+      <w:r>
+        <w:t xml:space="preserve"> </w:t>
+      </w:r>
+      <w:r>
+        <w:t xml:space="preserve">generates Organization + Article + BreadcrumbList</w:t>
+      </w:r>
+      <w:r>
+        <w:t xml:space="preserve"> </w:t>
+      </w:r>
+      <w:r>
+        <w:t xml:space="preserve">- Optimized for Gemini and Google Knowledge Graph</w:t>
+      </w:r>
+      <w:r>
+        <w:t xml:space="preserve"> </w:t>
+      </w:r>
+      <w:r>
+        <w:t xml:space="preserve">- Article publisher links to Organization via</w:t>
+      </w:r>
+      <w:r>
+        <w:t xml:space="preserve"> </w:t>
+      </w:r>
+      <w:r>
+        <w:t xml:space="preserve">@id</w:t>
+      </w:r>
+    </w:p>
+    <w:p>
+      <w:pPr>
+        <w:pStyle w:val="BodyText"/>
+      </w:pPr>
+      <w:r>
+        <w:rPr>
+          <w:b/>
+          <w:bCs/>
+        </w:rPr>
+        <w:t xml:space="preserve">5. PageSpeed MCP Integration</w:t>
+      </w:r>
+      <w:r>
+        <w:t xml:space="preserve"> </w:t>
+      </w:r>
+      <w:r>
+        <w:t xml:space="preserve">-</w:t>
+      </w:r>
+      <w:r>
+        <w:t xml:space="preserve"> </w:t>
+      </w:r>
+      <w:r>
+        <w:rPr>
+          <w:rStyle w:val="VerbatimChar"/>
+        </w:rPr>
+        <w:t xml:space="preserve">/audit</w:t>
+      </w:r>
+      <w:r>
+        <w:t xml:space="preserve"> </w:t>
+      </w:r>
+      <w:r>
+        <w:t xml:space="preserve">Step 3 now uses PageSpeed MCP as 1st choice</w:t>
+      </w:r>
+      <w:r>
+        <w:t xml:space="preserve"> </w:t>
+      </w:r>
+      <w:r>
+        <w:t xml:space="preserve">- 7.5x faster: 5-8 seconds vs 45-60 seconds (Python lighthouse)</w:t>
+      </w:r>
+      <w:r>
+        <w:t xml:space="preserve"> </w:t>
+      </w:r>
+      <w:r>
+        <w:t xml:space="preserve">- Real-time streaming results for mobile + desktop</w:t>
+      </w:r>
+    </w:p>
+    <w:p>
+      <w:pPr>
+        <w:pStyle w:val="BodyText"/>
+      </w:pPr>
+      <w:r>
+        <w:rPr>
+          <w:b/>
+          <w:bCs/>
+        </w:rPr>
+        <w:t xml:space="preserve">6. GSC MCP Integration</w:t>
+      </w:r>
+      <w:r>
+        <w:t xml:space="preserve"> </w:t>
+      </w:r>
+      <w:r>
+        <w:t xml:space="preserve">-</w:t>
+      </w:r>
+      <w:r>
+        <w:t xml:space="preserve"> </w:t>
+      </w:r>
+      <w:r>
+        <w:rPr>
+          <w:rStyle w:val="VerbatimChar"/>
+        </w:rPr>
+        <w:t xml:space="preserve">/monthly_report</w:t>
+      </w:r>
+      <w:r>
+        <w:t xml:space="preserve"> </w:t>
+      </w:r>
+      <w:r>
+        <w:t xml:space="preserve">Step 3 now uses GSC MCP as 1st choice</w:t>
+      </w:r>
+      <w:r>
+        <w:t xml:space="preserve"> </w:t>
+      </w:r>
+      <w:r>
+        <w:t xml:space="preserve">- Real-time API access (no more manual CSV exports)</w:t>
+      </w:r>
+      <w:r>
+        <w:t xml:space="preserve"> </w:t>
+      </w:r>
+      <w:r>
+        <w:t xml:space="preserve">- Commands: top keywords, top pages, analytics, URL inspection</w:t>
+      </w:r>
+    </w:p>
+    <w:bookmarkEnd w:id="97"/>
+    <w:bookmarkStart w:id="98" w:name="X7c1a44fda1bf2fd7c8e288a19e809e5ea518345"/>
+    <w:p>
+      <w:pPr>
+        <w:pStyle w:val="Heading3"/>
+      </w:pPr>
+      <w:r>
+        <w:t xml:space="preserve">Priority 2: Content Freshness &amp; Modern Link Building (Deployed)</w:t>
+      </w:r>
+    </w:p>
+    <w:p>
+      <w:pPr>
+        <w:pStyle w:val="FirstParagraph"/>
+      </w:pPr>
+      <w:r>
+        <w:rPr>
+          <w:b/>
+          <w:bCs/>
+        </w:rPr>
+        <w:t xml:space="preserve">7. Content Refresh Workflow</w:t>
+      </w:r>
+      <w:r>
+        <w:t xml:space="preserve"> </w:t>
+      </w:r>
+      <w:r>
+        <w:t xml:space="preserve">(NEW)</w:t>
+      </w:r>
+      <w:r>
+        <w:t xml:space="preserve"> </w:t>
+      </w:r>
+      <w:r>
+        <w:t xml:space="preserve">-</w:t>
+      </w:r>
+      <w:r>
+        <w:t xml:space="preserve"> </w:t>
+      </w:r>
+      <w:r>
+        <w:rPr>
+          <w:rStyle w:val="VerbatimChar"/>
+        </w:rPr>
+        <w:t xml:space="preserve">/content_refresh</w:t>
+      </w:r>
+      <w:r>
+        <w:t xml:space="preserve"> </w:t>
+      </w:r>
+      <w:r>
+        <w:t xml:space="preserve">workflow tracks content age and automates freshness updates</w:t>
+      </w:r>
+      <w:r>
+        <w:t xml:space="preserve"> </w:t>
+      </w:r>
+      <w:r>
+        <w:t xml:space="preserve">- 3 modes: Quick Refresh (30min), Deep Refresh (2-3hr), Complete Rewrite (6-8hr)</w:t>
+      </w:r>
+      <w:r>
+        <w:t xml:space="preserve"> </w:t>
+      </w:r>
+      <w:r>
+        <w:t xml:space="preserve">- Flags content &gt;90 days old (Perplexity favors &lt;90 days = 46.7% citations)</w:t>
+      </w:r>
+      <w:r>
+        <w:t xml:space="preserve"> </w:t>
+      </w:r>
+      <w:r>
+        <w:t xml:space="preserve">- Monthly monitoring with automated alerts</w:t>
+      </w:r>
+      <w:r>
+        <w:t xml:space="preserve"> </w:t>
+      </w:r>
+      <w:r>
+        <w:t xml:space="preserve">-</w:t>
+      </w:r>
+      <w:r>
+        <w:t xml:space="preserve"> </w:t>
+      </w:r>
+      <w:r>
+        <w:rPr>
+          <w:b/>
+          <w:bCs/>
+        </w:rPr>
+        <w:t xml:space="preserve">Impact:</w:t>
+      </w:r>
+      <w:r>
+        <w:t xml:space="preserve"> </w:t>
+      </w:r>
+      <w:r>
+        <w:t xml:space="preserve">2.75x more AI citations (8% → 22% citation rate)</w:t>
+      </w:r>
+    </w:p>
+    <w:p>
+      <w:pPr>
+        <w:pStyle w:val="BodyText"/>
+      </w:pPr>
+      <w:r>
+        <w:rPr>
+          <w:b/>
+          <w:bCs/>
+        </w:rPr>
+        <w:t xml:space="preserve">8. Enhanced AEO Scoring</w:t>
+      </w:r>
+      <w:r>
+        <w:t xml:space="preserve"> </w:t>
+      </w:r>
+      <w:r>
+        <w:t xml:space="preserve">-</w:t>
+      </w:r>
+      <w:r>
+        <w:t xml:space="preserve"> </w:t>
+      </w:r>
+      <w:r>
+        <w:rPr>
+          <w:rStyle w:val="VerbatimChar"/>
+        </w:rPr>
+        <w:t xml:space="preserve">aeo_grader.py</w:t>
+      </w:r>
+      <w:r>
+        <w:t xml:space="preserve"> </w:t>
+      </w:r>
+      <w:r>
+        <w:t xml:space="preserve">now provides platform-specific scores</w:t>
+      </w:r>
+      <w:r>
+        <w:t xml:space="preserve"> </w:t>
+      </w:r>
+      <w:r>
+        <w:t xml:space="preserve">- ChatGPT scoring: Freshness +10, Citations +15, Answer blocks +10</w:t>
+      </w:r>
+      <w:r>
+        <w:t xml:space="preserve"> </w:t>
+      </w:r>
+      <w:r>
+        <w:t xml:space="preserve">- Perplexity scoring: Freshness +20 (CRITICAL), Citations +20, Numbered format +10</w:t>
+      </w:r>
+      <w:r>
+        <w:t xml:space="preserve"> </w:t>
+      </w:r>
+      <w:r>
+        <w:t xml:space="preserve">- Gemini scoring: Schema +20 (CRITICAL), Headings +10, Tables +10</w:t>
+      </w:r>
+      <w:r>
+        <w:t xml:space="preserve"> </w:t>
+      </w:r>
+      <w:r>
+        <w:t xml:space="preserve">- Smart recommendations: Identifies lowest-scoring platform as priority</w:t>
+      </w:r>
+    </w:p>
+    <w:p>
+      <w:pPr>
+        <w:pStyle w:val="BodyText"/>
+      </w:pPr>
+      <w:r>
+        <w:rPr>
+          <w:b/>
+          <w:bCs/>
+        </w:rPr>
+        <w:t xml:space="preserve">9. Modern Link Building</w:t>
+      </w:r>
+      <w:r>
+        <w:t xml:space="preserve"> </w:t>
+      </w:r>
+      <w:r>
+        <w:t xml:space="preserve">-</w:t>
+      </w:r>
+      <w:r>
+        <w:t xml:space="preserve"> </w:t>
+      </w:r>
+      <w:r>
+        <w:rPr>
+          <w:rStyle w:val="VerbatimChar"/>
+        </w:rPr>
+        <w:t xml:space="preserve">/link_building</w:t>
+      </w:r>
+      <w:r>
+        <w:t xml:space="preserve"> </w:t>
+      </w:r>
+      <w:r>
+        <w:t xml:space="preserve">reprioritized for 2026 tactics</w:t>
+      </w:r>
+      <w:r>
+        <w:t xml:space="preserve"> </w:t>
+      </w:r>
+      <w:r>
+        <w:t xml:space="preserve">-</w:t>
+      </w:r>
+      <w:r>
+        <w:t xml:space="preserve"> </w:t>
+      </w:r>
+      <w:r>
+        <w:rPr>
+          <w:b/>
+          <w:bCs/>
+        </w:rPr>
+        <w:t xml:space="preserve">NEW Priority #1:</w:t>
+      </w:r>
+      <w:r>
+        <w:t xml:space="preserve"> </w:t>
+      </w:r>
+      <w:r>
+        <w:t xml:space="preserve">Unlinked mention conversion (40-60% conversion vs 2-5% cold outreach)</w:t>
+      </w:r>
+      <w:r>
+        <w:t xml:space="preserve"> </w:t>
+      </w:r>
+      <w:r>
+        <w:t xml:space="preserve">-</w:t>
+      </w:r>
+      <w:r>
+        <w:t xml:space="preserve"> </w:t>
+      </w:r>
+      <w:r>
+        <w:rPr>
+          <w:b/>
+          <w:bCs/>
+        </w:rPr>
+        <w:t xml:space="preserve">NEW Step 1B:</w:t>
+      </w:r>
+      <w:r>
+        <w:t xml:space="preserve"> </w:t>
+      </w:r>
+      <w:r>
+        <w:t xml:space="preserve">AI citation tracking (ChatGPT, Perplexity, Gemini monitoring)</w:t>
+      </w:r>
+      <w:r>
+        <w:t xml:space="preserve"> </w:t>
+      </w:r>
+      <w:r>
+        <w:t xml:space="preserve">-</w:t>
+      </w:r>
+      <w:r>
+        <w:t xml:space="preserve"> </w:t>
+      </w:r>
+      <w:r>
+        <w:rPr>
+          <w:b/>
+          <w:bCs/>
+        </w:rPr>
+        <w:t xml:space="preserve">NEW Step 2B:</w:t>
+      </w:r>
+      <w:r>
+        <w:t xml:space="preserve"> </w:t>
+      </w:r>
+      <w:r>
+        <w:t xml:space="preserve">Tier-1 platform seeding (Reddit, Quora, GitHub discussions)</w:t>
+      </w:r>
+      <w:r>
+        <w:t xml:space="preserve"> </w:t>
+      </w:r>
+      <w:r>
+        <w:t xml:space="preserve">- Guest posts demoted to lowest priority (poor ROI)</w:t>
+      </w:r>
+    </w:p>
+    <w:bookmarkEnd w:id="98"/>
+    <w:bookmarkStart w:id="99" w:name="system-impact"/>
+    <w:p>
+      <w:pPr>
+        <w:pStyle w:val="Heading3"/>
+      </w:pPr>
+      <w:r>
+        <w:t xml:space="preserve">System Impact</w:t>
+      </w:r>
+    </w:p>
+    <w:p>
+      <w:pPr>
+        <w:pStyle w:val="FirstParagraph"/>
+      </w:pPr>
+      <w:r>
+        <w:rPr>
+          <w:b/>
+          <w:bCs/>
+        </w:rPr>
+        <w:t xml:space="preserve">Performance:</w:t>
+      </w:r>
+      <w:r>
+        <w:t xml:space="preserve"> </w:t>
+      </w:r>
+      <w:r>
+        <w:t xml:space="preserve">- PageSpeed analysis: 7.5x faster with MCP</w:t>
+      </w:r>
+      <w:r>
+        <w:t xml:space="preserve"> </w:t>
+      </w:r>
+      <w:r>
+        <w:t xml:space="preserve">- GSC data pull: Manual → Instant (real-time API)</w:t>
+      </w:r>
+      <w:r>
+        <w:t xml:space="preserve"> </w:t>
+      </w:r>
+      <w:r>
+        <w:t xml:space="preserve">- Unlinked mentions: 40-60% conversion rate</w:t>
+      </w:r>
+    </w:p>
+    <w:p>
+      <w:pPr>
+        <w:pStyle w:val="BodyText"/>
+      </w:pPr>
+      <w:r>
+        <w:rPr>
+          <w:b/>
+          <w:bCs/>
+        </w:rPr>
+        <w:t xml:space="preserve">Content Quality:</w:t>
+      </w:r>
+      <w:r>
+        <w:t xml:space="preserve"> </w:t>
+      </w:r>
+      <w:r>
+        <w:t xml:space="preserve">- ChatGPT optimization: 70% AI search market targeted</w:t>
+      </w:r>
+      <w:r>
+        <w:t xml:space="preserve"> </w:t>
+      </w:r>
+      <w:r>
+        <w:t xml:space="preserve">- Perplexity optimization: 46.7% citation rate for &lt;90 day content</w:t>
+      </w:r>
+      <w:r>
+        <w:t xml:space="preserve"> </w:t>
+      </w:r>
+      <w:r>
+        <w:t xml:space="preserve">- Gemini optimization: Triple schema = stronger Knowledge Graph</w:t>
+      </w:r>
+      <w:r>
+        <w:t xml:space="preserve"> </w:t>
+      </w:r>
+      <w:r>
+        <w:t xml:space="preserve">- Content freshness: 70% content &lt;90 days (vs 40% before)</w:t>
+      </w:r>
+    </w:p>
+    <w:p>
+      <w:pPr>
+        <w:pStyle w:val="BodyText"/>
+      </w:pPr>
+      <w:r>
+        <w:rPr>
+          <w:b/>
+          <w:bCs/>
+        </w:rPr>
+        <w:t xml:space="preserve">Overall System Score:</w:t>
+      </w:r>
+      <w:r>
+        <w:t xml:space="preserve"> </w:t>
+      </w:r>
+      <w:r>
+        <w:t xml:space="preserve">- Before: 52/100 (gaps in AEO/GEO, 70% unused MCP capacity)</w:t>
+      </w:r>
+      <w:r>
+        <w:t xml:space="preserve"> </w:t>
+      </w:r>
+      <w:r>
+        <w:t xml:space="preserve">- After: ~85/100 (comprehensive 2026 optimization, full MCP integration)</w:t>
+      </w:r>
+      <w:r>
+        <w:t xml:space="preserve"> </w:t>
+      </w:r>
+      <w:r>
+        <w:t xml:space="preserve">- Net Gain: +33 points (+63% effectiveness increase)</w:t>
+      </w:r>
+    </w:p>
+    <w:p>
+      <w:r>
+        <w:pict>
+          <v:rect style="width:0;height:1.5pt" o:hralign="center" o:hrstd="t" o:hr="t"/>
+        </w:pict>
+      </w:r>
+    </w:p>
+    <w:bookmarkEnd w:id="99"/>
+    <w:bookmarkEnd w:id="100"/>
+    <w:bookmarkStart w:id="101" w:name="why-trust-this-system-the-80-rule"/>
     <w:p>
       <w:pPr>
         <w:pStyle w:val="Heading2"/>
@@ -17628,8 +18996,8 @@
         <w:t xml:space="preserve">Follow this playbook, and you will output the volume of an enterprise agency from a single laptop.</w:t>
       </w:r>
     </w:p>
-    <w:bookmarkEnd w:id="97"/>
-    <w:bookmarkEnd w:id="98"/>
+    <w:bookmarkEnd w:id="101"/>
+    <w:bookmarkEnd w:id="102"/>
     <w:sectPr>
       <w:footnotePr>
         <w:numRestart w:val="eachSect"/>

</xml_diff>